<commit_message>
feat: avatar upload na profilih in opendota snyc
</commit_message>
<xml_diff>
--- a/docs/reports/Iteracija_1_DotaOps_pregled.docx
+++ b/docs/reports/Iteracija_1_DotaOps_pregled.docx
@@ -1587,11 +1587,33 @@
       </w:r>
     </w:p>
     <w:p>
+      <w:proofErr w:type="spellStart"/>
       <w:r>
         <w:rPr>
           <w:b/>
         </w:rPr>
-        <w:t xml:space="preserve">Člani oziroma </w:t>
+        <w:t>Člani</w:t>
+      </w:r>
+      <w:proofErr w:type="spellEnd"/>
+      <w:r>
+        <w:rPr>
+          <w:b/>
+        </w:rPr>
+        <w:t xml:space="preserve"> </w:t>
+      </w:r>
+      <w:proofErr w:type="spellStart"/>
+      <w:r>
+        <w:rPr>
+          <w:b/>
+        </w:rPr>
+        <w:t>oziroma</w:t>
+      </w:r>
+      <w:proofErr w:type="spellEnd"/>
+      <w:r>
+        <w:rPr>
+          <w:b/>
+        </w:rPr>
+        <w:t xml:space="preserve"> </w:t>
       </w:r>
       <w:proofErr w:type="spellStart"/>
       <w:r>
@@ -1646,23 +1668,31 @@
     </w:p>
     <w:p>
       <w:r>
-        <w:t xml:space="preserve">Iteracija je zato pripravila temelje: Spring Boot zaledje, Flyway migracije za PostgreSQL/Supabase, Next.js vmesnik, varnostni sloj, API ovojnice, profile, ekipe, povabila, začetni OpenDota/Steam bootstrap in teste. Na tej osnovi se lahko v 2. iteraciji doda življenjski cikel turnirjev brez ponovnega izumljanja identitete, avtorizacije in </w:t>
+        <w:t xml:space="preserve">Iteracija je zato pripravila temelje: Spring Boot zaledje, Flyway migracije za PostgreSQL/Supabase, Next.js vmesnik, varnostni sloj, API ovojnice, profile, ekipe, povabila, začetni OpenDota/Steam bootstrap in teste. Na tej osnovi se lahko v 2. iteraciji doda življenjski cikel turnirjev brez ponovnega izumljanja </w:t>
       </w:r>
       <w:proofErr w:type="spellStart"/>
       <w:r>
+        <w:t>identitete</w:t>
+      </w:r>
+      <w:proofErr w:type="spellEnd"/>
+      <w:r>
+        <w:t xml:space="preserve">, </w:t>
+      </w:r>
+      <w:proofErr w:type="spellStart"/>
+      <w:r>
+        <w:t>avtorizacije</w:t>
+      </w:r>
+      <w:proofErr w:type="spellEnd"/>
+      <w:r>
+        <w:t xml:space="preserve"> in </w:t>
+      </w:r>
+      <w:proofErr w:type="spellStart"/>
+      <w:r>
         <w:t>osnovne</w:t>
       </w:r>
       <w:proofErr w:type="spellEnd"/>
       <w:r>
-        <w:t xml:space="preserve"> </w:t>
-      </w:r>
-      <w:proofErr w:type="spellStart"/>
-      <w:r>
-        <w:t>podatkovne</w:t>
-      </w:r>
-      <w:proofErr w:type="spellEnd"/>
-      <w:r>
-        <w:t xml:space="preserve"> </w:t>
+        <w:t xml:space="preserve"> podatkovne </w:t>
       </w:r>
       <w:proofErr w:type="spellStart"/>
       <w:r>
@@ -2022,11 +2052,7 @@
       </w:tr>
     </w:tbl>
     <w:p/>
-    <w:p>
-      <w:r>
-        <w:t>Uporabljene različice so bile preverjene neposredno v konfiguraciji projekta:</w:t>
-      </w:r>
-    </w:p>
+    <w:p/>
     <w:tbl>
       <w:tblPr>
         <w:tblStyle w:val="Tabelamrea"/>
@@ -2562,7 +2588,31 @@
     </w:p>
     <w:p>
       <w:r>
-        <w:t xml:space="preserve">To je posebej pomembno pri Supabase/PostgreSQL, ker projekt uporablja RLS politike, enum tipe, triggerje, poglede in varnostne funkcije. Teh pravil ni smiselno </w:t>
+        <w:t xml:space="preserve">To je posebej pomembno pri Supabase/PostgreSQL, ker projekt uporablja RLS politike, enum tipe, triggerje, poglede in varnostne funkcije. Teh </w:t>
+      </w:r>
+      <w:proofErr w:type="spellStart"/>
+      <w:r>
+        <w:t>pravil</w:t>
+      </w:r>
+      <w:proofErr w:type="spellEnd"/>
+      <w:r>
+        <w:t xml:space="preserve"> </w:t>
+      </w:r>
+      <w:proofErr w:type="spellStart"/>
+      <w:r>
+        <w:t>ni</w:t>
+      </w:r>
+      <w:proofErr w:type="spellEnd"/>
+      <w:r>
+        <w:t xml:space="preserve"> </w:t>
+      </w:r>
+      <w:proofErr w:type="spellStart"/>
+      <w:r>
+        <w:t>smiselno</w:t>
+      </w:r>
+      <w:proofErr w:type="spellEnd"/>
+      <w:r>
+        <w:t xml:space="preserve"> </w:t>
       </w:r>
       <w:proofErr w:type="spellStart"/>
       <w:r>
@@ -3133,14 +3183,32 @@
       <w:r>
         <w:t xml:space="preserve"> preveri, ali je trenutni profil kapetan ekipe, organizator ali admin. </w:t>
       </w:r>
+      <w:proofErr w:type="spellStart"/>
       <w:r>
         <w:rPr>
           <w:rFonts w:ascii="Consolas" w:eastAsia="Consolas" w:hAnsi="Consolas"/>
         </w:rPr>
         <w:t>TeamRosterService</w:t>
       </w:r>
-      <w:r>
-        <w:t xml:space="preserve"> enako preverja </w:t>
+      <w:proofErr w:type="spellEnd"/>
+      <w:r>
+        <w:t xml:space="preserve"> </w:t>
+      </w:r>
+      <w:proofErr w:type="spellStart"/>
+      <w:r>
+        <w:t>enako</w:t>
+      </w:r>
+      <w:proofErr w:type="spellEnd"/>
+      <w:r>
+        <w:t xml:space="preserve"> </w:t>
+      </w:r>
+      <w:proofErr w:type="spellStart"/>
+      <w:r>
+        <w:t>preverja</w:t>
+      </w:r>
+      <w:proofErr w:type="spellEnd"/>
+      <w:r>
+        <w:t xml:space="preserve"> </w:t>
       </w:r>
       <w:proofErr w:type="spellStart"/>
       <w:r>
@@ -4421,7 +4489,15 @@
         <w:t>CurrentUserProvider</w:t>
       </w:r>
       <w:r>
-        <w:t xml:space="preserve"> ločena od predpostavke, da je vsak </w:t>
+        <w:t xml:space="preserve"> ločena od predpostavke, da je </w:t>
+      </w:r>
+      <w:proofErr w:type="spellStart"/>
+      <w:r>
+        <w:t>vsak</w:t>
+      </w:r>
+      <w:proofErr w:type="spellEnd"/>
+      <w:r>
+        <w:t xml:space="preserve"> </w:t>
       </w:r>
       <w:proofErr w:type="spellStart"/>
       <w:r>
@@ -4701,7 +4777,15 @@
     </w:p>
     <w:p>
       <w:r>
-        <w:t xml:space="preserve">Ponavljajoča pending povabila so preprečena z bazo in servisno validacijo. Ta del neposredno pripravlja 2. iteracijo, ker se bo ekipa na turnir prijavljala skupaj z rosterjem, ne z </w:t>
+        <w:t xml:space="preserve">Ponavljajoča pending povabila so preprečena z bazo in servisno validacijo. Ta del neposredno pripravlja 2. iteracijo, ker se bo ekipa na turnir prijavljala skupaj z </w:t>
+      </w:r>
+      <w:proofErr w:type="spellStart"/>
+      <w:r>
+        <w:t>rosterjem</w:t>
+      </w:r>
+      <w:proofErr w:type="spellEnd"/>
+      <w:r>
+        <w:t xml:space="preserve">, ne z </w:t>
       </w:r>
       <w:proofErr w:type="spellStart"/>
       <w:r>
@@ -5320,7 +5404,7 @@
     </w:p>
     <w:p>
       <w:r>
-        <w:t xml:space="preserve">Polna OpenDota analitika še ni zaključena. Issue-ji #51, #52, #53, #54 in #55 so na Kanban tabli v kasnejših iteracijah in ostajajo odprti, zato se ta del šteje kot foundation, ne </w:t>
+        <w:t xml:space="preserve">Polna OpenDota analitika še ni zaključena. Issue-ji #51, #52, #53, #54 in #55 so na Kanban tabli v kasnejših iteracijah in ostajajo odprti, zato se ta del šteje </w:t>
       </w:r>
       <w:proofErr w:type="spellStart"/>
       <w:r>
@@ -5328,15 +5412,15 @@
       </w:r>
       <w:proofErr w:type="spellEnd"/>
       <w:r>
-        <w:t xml:space="preserve"> </w:t>
+        <w:t xml:space="preserve"> foundation, ne </w:t>
       </w:r>
       <w:proofErr w:type="spellStart"/>
       <w:r>
-        <w:t>končni</w:t>
+        <w:t>kot</w:t>
       </w:r>
       <w:proofErr w:type="spellEnd"/>
       <w:r>
-        <w:t xml:space="preserve"> analytics </w:t>
+        <w:t xml:space="preserve"> končni analytics </w:t>
       </w:r>
       <w:proofErr w:type="spellStart"/>
       <w:r>
@@ -9189,23 +9273,39 @@
     </w:p>
     <w:p>
       <w:r>
-        <w:t xml:space="preserve">Zato se lahko v 2. iteraciji doda življenjski cikel turnirja, prijave ekip in organizatorski tokovi na obstoječe temelje, namesto da bi bilo treba najprej reševati identiteto, lastništvo ekip </w:t>
+        <w:t xml:space="preserve">Zato se lahko v 2. iteraciji doda življenjski cikel turnirja, prijave ekip in organizatorski tokovi na obstoječe temelje, namesto da bi bilo treba najprej reševati </w:t>
       </w:r>
       <w:proofErr w:type="spellStart"/>
       <w:r>
+        <w:t>identiteto</w:t>
+      </w:r>
+      <w:proofErr w:type="spellEnd"/>
+      <w:r>
+        <w:t xml:space="preserve">, </w:t>
+      </w:r>
+      <w:proofErr w:type="spellStart"/>
+      <w:r>
+        <w:t>lastništvo</w:t>
+      </w:r>
+      <w:proofErr w:type="spellEnd"/>
+      <w:r>
+        <w:t xml:space="preserve"> </w:t>
+      </w:r>
+      <w:proofErr w:type="spellStart"/>
+      <w:r>
+        <w:t>ekip</w:t>
+      </w:r>
+      <w:proofErr w:type="spellEnd"/>
+      <w:r>
+        <w:t xml:space="preserve"> </w:t>
+      </w:r>
+      <w:proofErr w:type="spellStart"/>
+      <w:r>
         <w:t>ali</w:t>
       </w:r>
       <w:proofErr w:type="spellEnd"/>
       <w:r>
-        <w:t xml:space="preserve"> </w:t>
-      </w:r>
-      <w:proofErr w:type="spellStart"/>
-      <w:r>
-        <w:t>osnovne</w:t>
-      </w:r>
-      <w:proofErr w:type="spellEnd"/>
-      <w:r>
-        <w:t xml:space="preserve"> DB constraints.</w:t>
+        <w:t xml:space="preserve"> osnovne DB constraints.</w:t>
       </w:r>
     </w:p>
     <w:p/>

</xml_diff>